<commit_message>
Expand chemical carcinogens lecture to 72 widescreen slides
Keep the full teaching breadth (mechanisms, occupational catalogues, tobacco lists, radiation) and regenerate the companion Word script; deliverables also copied to Desktop/artifacts.

Co-authored-by: bilgegursel <bilgegursel@users.noreply.github.com>
</commit_message>
<xml_diff>
--- a/elektif-radyasyon-onkolojisi-donem5/chemical-carcinogens-lecture/Lecture_Script_Cancer_Predisposing_Factors.docx
+++ b/elektif-radyasyon-onkolojisi-donem5/chemical-carcinogens-lecture/Lecture_Script_Cancer_Predisposing_Factors.docx
@@ -801,7 +801,7 @@
         <w:rPr>
           <w:color w:val="143242"/>
         </w:rPr>
-        <w:t>7. Suggested Classroom Timing (≈ 50–55 minutes)</w:t>
+        <w:t>7. Suggested Classroom Timing (≈ 70–80 minutes, or split into 2 sessions)</w:t>
       </w:r>
     </w:p>
     <w:p>
@@ -812,7 +812,7 @@
         <w:rPr>
           <w:sz w:val="22"/>
         </w:rPr>
-        <w:t>0–3 min — Hook &amp; objectives</w:t>
+        <w:t>0–5 min — Hook &amp; objectives</w:t>
       </w:r>
     </w:p>
     <w:p>
@@ -823,7 +823,7 @@
         <w:rPr>
           <w:sz w:val="22"/>
         </w:rPr>
-        <w:t>3–12 min — Predisposing factors &amp; avoidable risks</w:t>
+        <w:t>5–18 min — Predisposing factors, avoidable risks, migration evidence</w:t>
       </w:r>
     </w:p>
     <w:p>
@@ -834,7 +834,7 @@
         <w:rPr>
           <w:sz w:val="22"/>
         </w:rPr>
-        <w:t>12–32 min — Chemical carcinogens &amp; occupation</w:t>
+        <w:t>18–45 min — Chemical carcinogens (mechanisms + environmental/occupational catalogue)</w:t>
       </w:r>
     </w:p>
     <w:p>
@@ -845,7 +845,7 @@
         <w:rPr>
           <w:sz w:val="22"/>
         </w:rPr>
-        <w:t>32–43 min — Tobacco</w:t>
+        <w:t>45–60 min — Tobacco (constituents, mechanisms, multi-site disease)</w:t>
       </w:r>
     </w:p>
     <w:p>
@@ -856,7 +856,7 @@
         <w:rPr>
           <w:sz w:val="22"/>
         </w:rPr>
-        <w:t>43–53 min — Radiation</w:t>
+        <w:t>60–75 min — Radiation carcinogenesis</w:t>
       </w:r>
     </w:p>
     <w:p>
@@ -867,7 +867,18 @@
         <w:rPr>
           <w:sz w:val="22"/>
         </w:rPr>
-        <w:t>53–55 min — Prevention &amp; take-home messages</w:t>
+        <w:t>75–80 min — Prevention &amp; take-home messages</w:t>
+      </w:r>
+    </w:p>
+    <w:p>
+      <w:pPr>
+        <w:pStyle w:val="ListBullet"/>
+      </w:pPr>
+      <w:r>
+        <w:rPr>
+          <w:sz w:val="22"/>
+        </w:rPr>
+        <w:t>If time is short: keep all mechanism slides; skim long agent lists and point students to the deck.</w:t>
       </w:r>
     </w:p>
     <w:p>

</xml_diff>